<commit_message>
docs(competition): 由 build_review_docx.py 重新生成 Word 版评审报告（同步 VM 证据包口径）
</commit_message>
<xml_diff>
--- a/competition/宛委枢忆-评审报告.docx
+++ b/competition/宛委枢忆-评审报告.docx
@@ -1616,7 +1616,57 @@
           <w:b w:val="0"/>
           <w:sz w:val="24"/>
         </w:rPr>
-        <w:t>麒麟 V11 虚拟机实测：原生 SDK 常驻桥接进程改造后，HTTP 全链路 p50 29ms / p95 83ms（原 spawn 模式约 200ms）；</w:t>
+        <w:t xml:space="preserve">麒麟 V11 虚拟机实测（2026-09-08 当日连续采集，证据索引 </w:t>
+      </w:r>
+      <w:r>
+        <w:rPr>
+          <w:rFonts w:ascii="微软雅黑" w:hAnsi="微软雅黑" w:eastAsia="微软雅黑"/>
+          <w:b w:val="0"/>
+          <w:color w:val="7A3300"/>
+          <w:sz w:val="24"/>
+        </w:rPr>
+        <w:t>competition/09-vm-evidence.md</w:t>
+      </w:r>
+      <w:r>
+        <w:rPr>
+          <w:rFonts w:ascii="微软雅黑" w:hAnsi="微软雅黑" w:eastAsia="微软雅黑"/>
+          <w:b w:val="0"/>
+          <w:sz w:val="24"/>
+        </w:rPr>
+        <w:t xml:space="preserve">）：麒麟原生 embedding+vector SDK 常驻桥接（bridge）端到端检索 </w:t>
+      </w:r>
+      <w:r>
+        <w:rPr>
+          <w:rFonts w:ascii="微软雅黑" w:hAnsi="微软雅黑" w:eastAsia="微软雅黑"/>
+          <w:b/>
+          <w:sz w:val="24"/>
+        </w:rPr>
+        <w:t>p50 27.51ms / p95 92.675ms / max 115.393ms</w:t>
+      </w:r>
+      <w:r>
+        <w:rPr>
+          <w:rFonts w:ascii="微软雅黑" w:hAnsi="微软雅黑" w:eastAsia="微软雅黑"/>
+          <w:b w:val="0"/>
+          <w:sz w:val="24"/>
+        </w:rPr>
+        <w:t>（30 次计时 + 1 次预热，</w:t>
+      </w:r>
+      <w:r>
+        <w:rPr>
+          <w:rFonts w:ascii="微软雅黑" w:hAnsi="微软雅黑" w:eastAsia="微软雅黑"/>
+          <w:b w:val="0"/>
+          <w:color w:val="7A3300"/>
+          <w:sz w:val="24"/>
+        </w:rPr>
+        <w:t>reports/kylin-vm-evidence-20260908/06-kylin-sdk-latency.json</w:t>
+      </w:r>
+      <w:r>
+        <w:rPr>
+          <w:rFonts w:ascii="微软雅黑" w:hAnsi="微软雅黑" w:eastAsia="微软雅黑"/>
+          <w:b w:val="0"/>
+          <w:sz w:val="24"/>
+        </w:rPr>
+        <w:t>）；常驻 bridge 将模型加载移出请求路径，相对 2026-07 one-shot 冷启动口径（p50 195.32ms / p95 246.47ms）端到端 p95 由 246.5ms 降至 92.7ms；</w:t>
       </w:r>
     </w:p>
     <w:p>
@@ -1629,7 +1679,23 @@
           <w:b w:val="0"/>
           <w:sz w:val="24"/>
         </w:rPr>
-        <w:t>延迟规模曲线（端侧 SQLite FTS5，50 条中文查询）：1k 条记忆 p95 4.61ms、10k 条 77.06ms、50k 条 447.94ms（</w:t>
+        <w:t>延迟规模曲线（麒麟 V11 VM 实测，端侧 SQLite FTS5 纯词面通道，1k/10k/50k × 冷热 × 50 查询）：</w:t>
+      </w:r>
+      <w:r>
+        <w:rPr>
+          <w:rFonts w:ascii="微软雅黑" w:hAnsi="微软雅黑" w:eastAsia="微软雅黑"/>
+          <w:b/>
+          <w:sz w:val="24"/>
+        </w:rPr>
+        <w:t>冷态 p95 = 6.0 / 53.2 / 224.6ms，热态 p95 = 3.8 / 45.7 / 210.0ms</w:t>
+      </w:r>
+      <w:r>
+        <w:rPr>
+          <w:rFonts w:ascii="微软雅黑" w:hAnsi="微软雅黑" w:eastAsia="微软雅黑"/>
+          <w:b w:val="0"/>
+          <w:sz w:val="24"/>
+        </w:rPr>
+        <w:t>（</w:t>
       </w:r>
       <w:r>
         <w:rPr>
@@ -1638,7 +1704,7 @@
           <w:color w:val="7A3300"/>
           <w:sz w:val="24"/>
         </w:rPr>
-        <w:t>reports/latency_scale.json</w:t>
+        <w:t>reports/kylin-vm-evidence-20260908/05b-latency-scale-fts-only.json</w:t>
       </w:r>
       <w:r>
         <w:rPr>
@@ -1646,7 +1712,7 @@
           <w:b w:val="0"/>
           <w:sz w:val="24"/>
         </w:rPr>
-        <w:t xml:space="preserve"> 逐次原始样本可复现）——10 万条量级内满足赛题 ≤500ms 指标；</w:t>
+        <w:t xml:space="preserve"> 逐次原始样本可复现）——纯词面回退通道在 5 万条记忆下仍满足赛题 ≤500ms 指标；</w:t>
       </w:r>
     </w:p>
     <w:p>
@@ -1712,7 +1778,54 @@
           <w:b/>
           <w:sz w:val="28"/>
         </w:rPr>
-        <w:t>3.1 赛题硬指标对照（v1.0.0 验收口径）</w:t>
+        <w:t>3.1 赛题硬指标对照（2026-09-08 麒麟 V11 VM 实测口径）</w:t>
+      </w:r>
+    </w:p>
+    <w:p>
+      <w:r>
+        <w:rPr>
+          <w:rFonts w:ascii="微软雅黑" w:hAnsi="微软雅黑" w:eastAsia="微软雅黑"/>
+          <w:b w:val="0"/>
+          <w:color w:val="5B6B7A"/>
+          <w:sz w:val="22"/>
+        </w:rPr>
+        <w:t xml:space="preserve">以下实测值全部产自 2026-09-08 银河麒麟 V11 虚拟机内的连续采集会话，原始数据与逐次样本见 </w:t>
+      </w:r>
+      <w:r>
+        <w:rPr>
+          <w:rFonts w:ascii="微软雅黑" w:hAnsi="微软雅黑" w:eastAsia="微软雅黑"/>
+          <w:b w:val="0"/>
+          <w:color w:val="5B6B7A"/>
+          <w:sz w:val="22"/>
+        </w:rPr>
+        <w:t>competition/09-vm-evidence.md</w:t>
+      </w:r>
+      <w:r>
+        <w:rPr>
+          <w:rFonts w:ascii="微软雅黑" w:hAnsi="微软雅黑" w:eastAsia="微软雅黑"/>
+          <w:b w:val="0"/>
+          <w:color w:val="5B6B7A"/>
+          <w:sz w:val="22"/>
+        </w:rPr>
+        <w:t xml:space="preserve"> 及 </w:t>
+      </w:r>
+      <w:r>
+        <w:rPr>
+          <w:rFonts w:ascii="微软雅黑" w:hAnsi="微软雅黑" w:eastAsia="微软雅黑"/>
+          <w:b w:val="0"/>
+          <w:color w:val="5B6B7A"/>
+          <w:sz w:val="22"/>
+        </w:rPr>
+        <w:t>reports/kylin-vm-evidence-20260908/</w:t>
+      </w:r>
+      <w:r>
+        <w:rPr>
+          <w:rFonts w:ascii="微软雅黑" w:hAnsi="微软雅黑" w:eastAsia="微软雅黑"/>
+          <w:b w:val="0"/>
+          <w:color w:val="5B6B7A"/>
+          <w:sz w:val="22"/>
+        </w:rPr>
+        <w:t>（34 文件 + SHA256SUMS 完整性清单）。</w:t>
       </w:r>
     </w:p>
     <w:tbl>
@@ -1845,10 +1958,50 @@
             <w:r>
               <w:rPr>
                 <w:rFonts w:ascii="微软雅黑" w:hAnsi="微软雅黑" w:eastAsia="微软雅黑"/>
+                <w:b w:val="0"/>
+                <w:sz w:val="22"/>
+              </w:rPr>
+              <w:t xml:space="preserve">历史宽口径 12 例 </w:t>
+            </w:r>
+            <w:r>
+              <w:rPr>
+                <w:rFonts w:ascii="微软雅黑" w:hAnsi="微软雅黑" w:eastAsia="微软雅黑"/>
                 <w:b/>
                 <w:sz w:val="22"/>
               </w:rPr>
               <w:t>91.7%</w:t>
+            </w:r>
+            <w:r>
+              <w:rPr>
+                <w:rFonts w:ascii="微软雅黑" w:hAnsi="微软雅黑" w:eastAsia="微软雅黑"/>
+                <w:b w:val="0"/>
+                <w:sz w:val="22"/>
+              </w:rPr>
+              <w:t xml:space="preserve">；VM 当日公开集 4 例粒度 </w:t>
+            </w:r>
+            <w:r>
+              <w:rPr>
+                <w:rFonts w:ascii="微软雅黑" w:hAnsi="微软雅黑" w:eastAsia="微软雅黑"/>
+                <w:b/>
+                <w:sz w:val="22"/>
+              </w:rPr>
+              <w:t>3/4=75%</w:t>
+            </w:r>
+            <w:r>
+              <w:rPr>
+                <w:rFonts w:ascii="微软雅黑" w:hAnsi="微软雅黑" w:eastAsia="微软雅黑"/>
+                <w:b w:val="0"/>
+                <w:sz w:val="22"/>
+              </w:rPr>
+              <w:t xml:space="preserve">；词面通道 </w:t>
+            </w:r>
+            <w:r>
+              <w:rPr>
+                <w:rFonts w:ascii="微软雅黑" w:hAnsi="微软雅黑" w:eastAsia="微软雅黑"/>
+                <w:b/>
+                <w:sz w:val="22"/>
+              </w:rPr>
+              <w:t>4/4=100%</w:t>
             </w:r>
           </w:p>
         </w:tc>
@@ -1863,7 +2016,7 @@
                 <w:b w:val="0"/>
                 <w:sz w:val="22"/>
               </w:rPr>
-              <w:t>✅ 超 6.7 个百分点</w:t>
+              <w:t>⚠️ 多口径如实报告，未达口径已附优化方向（§3.4）</w:t>
             </w:r>
           </w:p>
         </w:tc>
@@ -1887,7 +2040,7 @@
                 <w:b w:val="0"/>
                 <w:sz w:val="22"/>
               </w:rPr>
-              <w:t xml:space="preserve">（MEB full 60 例 hybrid 组 </w:t>
+              <w:t>；</w:t>
             </w:r>
             <w:r>
               <w:rPr>
@@ -1896,7 +2049,7 @@
                 <w:color w:val="7A3300"/>
                 <w:sz w:val="22"/>
               </w:rPr>
-              <w:t>preference_extraction_accuracy=0.9167</w:t>
+              <w:t>09-vm-evidence.md</w:t>
             </w:r>
             <w:r>
               <w:rPr>
@@ -1904,7 +2057,7 @@
                 <w:b w:val="0"/>
                 <w:sz w:val="22"/>
               </w:rPr>
-              <w:t>）</w:t>
+              <w:t xml:space="preserve"> §二.4（MEB-PREF-003 泄漏归因）</w:t>
             </w:r>
           </w:p>
         </w:tc>
@@ -1951,7 +2104,7 @@
                 <w:b/>
                 <w:sz w:val="22"/>
               </w:rPr>
-              <w:t>100%</w:t>
+              <w:t>Recall@5 = 1.0</w:t>
             </w:r>
           </w:p>
         </w:tc>
@@ -1981,7 +2134,7 @@
                 <w:b w:val="0"/>
                 <w:sz w:val="22"/>
               </w:rPr>
-              <w:t>同上（</w:t>
+              <w:t>VM 当日 MEB full 双配置（生产路径 + 回退链）与四臂消融全部 Recall@5=1.0（</w:t>
             </w:r>
             <w:r>
               <w:rPr>
@@ -1990,7 +2143,7 @@
                 <w:color w:val="7A3300"/>
                 <w:sz w:val="22"/>
               </w:rPr>
-              <w:t>knowledge_recall=1.0</w:t>
+              <w:t>01b-*</w:t>
             </w:r>
             <w:r>
               <w:rPr>
@@ -1998,7 +2151,7 @@
                 <w:b w:val="0"/>
                 <w:sz w:val="22"/>
               </w:rPr>
-              <w:t>）；MEB mini 召回 3/3（</w:t>
+              <w:t xml:space="preserve"> / </w:t>
             </w:r>
             <w:r>
               <w:rPr>
@@ -2007,7 +2160,24 @@
                 <w:color w:val="7A3300"/>
                 <w:sz w:val="22"/>
               </w:rPr>
-              <w:t>reports/meb_score_report.json</w:t>
+              <w:t>01-*</w:t>
+            </w:r>
+            <w:r>
+              <w:rPr>
+                <w:rFonts w:ascii="微软雅黑" w:hAnsi="微软雅黑" w:eastAsia="微软雅黑"/>
+                <w:b w:val="0"/>
+                <w:sz w:val="22"/>
+              </w:rPr>
+              <w:t xml:space="preserve"> / </w:t>
+            </w:r>
+            <w:r>
+              <w:rPr>
+                <w:rFonts w:ascii="微软雅黑" w:hAnsi="微软雅黑" w:eastAsia="微软雅黑"/>
+                <w:b w:val="0"/>
+                <w:color w:val="7A3300"/>
+                <w:sz w:val="22"/>
+              </w:rPr>
+              <w:t>02-baseline-compare.json</w:t>
             </w:r>
             <w:r>
               <w:rPr>
@@ -2062,7 +2232,15 @@
                 <w:b/>
                 <w:sz w:val="22"/>
               </w:rPr>
-              <w:t>p95 83ms</w:t>
+              <w:t>p95 92.675ms</w:t>
+            </w:r>
+            <w:r>
+              <w:rPr>
+                <w:rFonts w:ascii="微软雅黑" w:hAnsi="微软雅黑" w:eastAsia="微软雅黑"/>
+                <w:b w:val="0"/>
+                <w:sz w:val="22"/>
+              </w:rPr>
+              <w:t>（p50 27.51ms / max 115.393ms）</w:t>
             </w:r>
           </w:p>
         </w:tc>
@@ -2077,7 +2255,7 @@
                 <w:b w:val="0"/>
                 <w:sz w:val="22"/>
               </w:rPr>
-              <w:t>✅ 6 倍余量</w:t>
+              <w:t>✅ 5 倍以上余量</w:t>
             </w:r>
           </w:p>
         </w:tc>
@@ -2092,7 +2270,41 @@
                 <w:b w:val="0"/>
                 <w:sz w:val="22"/>
               </w:rPr>
-              <w:t>麒麟 V11 实机 HTTP 全链路实测（v1.0.0 验收，CHANGELOG 2026-09-05 条目）</w:t>
+              <w:t>麒麟 SDK 常驻 bridge 30 次端到端实测（</w:t>
+            </w:r>
+            <w:r>
+              <w:rPr>
+                <w:rFonts w:ascii="微软雅黑" w:hAnsi="微软雅黑" w:eastAsia="微软雅黑"/>
+                <w:b w:val="0"/>
+                <w:color w:val="7A3300"/>
+                <w:sz w:val="22"/>
+              </w:rPr>
+              <w:t>06-kylin-sdk-latency.json</w:t>
+            </w:r>
+            <w:r>
+              <w:rPr>
+                <w:rFonts w:ascii="微软雅黑" w:hAnsi="微软雅黑" w:eastAsia="微软雅黑"/>
+                <w:b w:val="0"/>
+                <w:sz w:val="22"/>
+              </w:rPr>
+              <w:t>）；纯词面通道 50k 条冷态 p95 224.6ms（</w:t>
+            </w:r>
+            <w:r>
+              <w:rPr>
+                <w:rFonts w:ascii="微软雅黑" w:hAnsi="微软雅黑" w:eastAsia="微软雅黑"/>
+                <w:b w:val="0"/>
+                <w:color w:val="7A3300"/>
+                <w:sz w:val="22"/>
+              </w:rPr>
+              <w:t>05b-*</w:t>
+            </w:r>
+            <w:r>
+              <w:rPr>
+                <w:rFonts w:ascii="微软雅黑" w:hAnsi="微软雅黑" w:eastAsia="微软雅黑"/>
+                <w:b w:val="0"/>
+                <w:sz w:val="22"/>
+              </w:rPr>
+              <w:t>）</w:t>
             </w:r>
           </w:p>
         </w:tc>
@@ -2139,7 +2351,7 @@
                 <w:b/>
                 <w:sz w:val="22"/>
               </w:rPr>
-              <w:t>100%</w:t>
+              <w:t>100%（4/4）</w:t>
             </w:r>
           </w:p>
         </w:tc>
@@ -2169,7 +2381,7 @@
                 <w:b w:val="0"/>
                 <w:sz w:val="22"/>
               </w:rPr>
-              <w:t>同上 baseline_compare（</w:t>
+              <w:t>VM 当日 MEB full 冲突用例 4/4；no_governance 消融臂 0/4 对照，治理贡献直接量化（</w:t>
             </w:r>
             <w:r>
               <w:rPr>
@@ -2178,7 +2390,7 @@
                 <w:color w:val="7A3300"/>
                 <w:sz w:val="22"/>
               </w:rPr>
-              <w:t>conflict_correctness=1.0</w:t>
+              <w:t>01b-*</w:t>
             </w:r>
             <w:r>
               <w:rPr>
@@ -2186,7 +2398,24 @@
                 <w:b w:val="0"/>
                 <w:sz w:val="22"/>
               </w:rPr>
-              <w:t>）；MEB mini 冲突更新用例 3/3</w:t>
+              <w:t xml:space="preserve"> / </w:t>
+            </w:r>
+            <w:r>
+              <w:rPr>
+                <w:rFonts w:ascii="微软雅黑" w:hAnsi="微软雅黑" w:eastAsia="微软雅黑"/>
+                <w:b w:val="0"/>
+                <w:color w:val="7A3300"/>
+                <w:sz w:val="22"/>
+              </w:rPr>
+              <w:t>02-baseline-compare.json</w:t>
+            </w:r>
+            <w:r>
+              <w:rPr>
+                <w:rFonts w:ascii="微软雅黑" w:hAnsi="微软雅黑" w:eastAsia="微软雅黑"/>
+                <w:b w:val="0"/>
+                <w:sz w:val="22"/>
+              </w:rPr>
+              <w:t>）</w:t>
             </w:r>
           </w:p>
         </w:tc>
@@ -2261,7 +2490,23 @@
           <w:b w:val="0"/>
           <w:sz w:val="24"/>
         </w:rPr>
-        <w:t>：5 例真实写路径场景、16 条断言，</w:t>
+        <w:t xml:space="preserve">：MemoryArena-Lite 6 场景 </w:t>
+      </w:r>
+      <w:r>
+        <w:rPr>
+          <w:rFonts w:ascii="微软雅黑" w:hAnsi="微软雅黑" w:eastAsia="微软雅黑"/>
+          <w:b/>
+          <w:sz w:val="24"/>
+        </w:rPr>
+        <w:t>20/20 断言全过</w:t>
+      </w:r>
+      <w:r>
+        <w:rPr>
+          <w:rFonts w:ascii="微软雅黑" w:hAnsi="微软雅黑" w:eastAsia="微软雅黑"/>
+          <w:b w:val="0"/>
+          <w:sz w:val="24"/>
+        </w:rPr>
+        <w:t>（2026-09-08 VM 复测，</w:t>
       </w:r>
       <w:r>
         <w:rPr>
@@ -2278,7 +2523,7 @@
           <w:b w:val="0"/>
           <w:sz w:val="24"/>
         </w:rPr>
-        <w:t>（</w:t>
+        <w:t>，evidence_card_coverage / policy_gate_hit / lifecycle_correct 均 1.0，</w:t>
       </w:r>
       <w:r>
         <w:rPr>
@@ -2287,7 +2532,24 @@
           <w:color w:val="7A3300"/>
           <w:sz w:val="24"/>
         </w:rPr>
-        <w:t>reports/production_memory_eval_metrics.json</w:t>
+        <w:t>reports/kylin-vm-evidence-20260908/08-arena-console.txt</w:t>
+      </w:r>
+      <w:r>
+        <w:rPr>
+          <w:rFonts w:ascii="微软雅黑" w:hAnsi="微软雅黑" w:eastAsia="微软雅黑"/>
+          <w:b w:val="0"/>
+          <w:sz w:val="24"/>
+        </w:rPr>
+        <w:t xml:space="preserve"> + </w:t>
+      </w:r>
+      <w:r>
+        <w:rPr>
+          <w:rFonts w:ascii="微软雅黑" w:hAnsi="微软雅黑" w:eastAsia="微软雅黑"/>
+          <w:b w:val="0"/>
+          <w:color w:val="7A3300"/>
+          <w:sz w:val="24"/>
+        </w:rPr>
+        <w:t>arena/production_memory_eval_metrics.json</w:t>
       </w:r>
       <w:r>
         <w:rPr>
@@ -2316,7 +2578,24 @@
           <w:b w:val="0"/>
           <w:sz w:val="24"/>
         </w:rPr>
-        <w:t xml:space="preserve">：四场景双时态用例（软件/流程/规范/延迟导入），逐采样判定见 </w:t>
+        <w:t>：四场景双时态用例（软件/流程/规范/延迟导入），VM 当日复测 Active Knowledge Accuracy 与 Evolution Chain Accuracy 双 100%（</w:t>
+      </w:r>
+      <w:r>
+        <w:rPr>
+          <w:rFonts w:ascii="微软雅黑" w:hAnsi="微软雅黑" w:eastAsia="微软雅黑"/>
+          <w:b w:val="0"/>
+          <w:color w:val="7A3300"/>
+          <w:sz w:val="24"/>
+        </w:rPr>
+        <w:t>reports/kylin-vm-evidence-20260908/04-tke-benchmark.json</w:t>
+      </w:r>
+      <w:r>
+        <w:rPr>
+          <w:rFonts w:ascii="微软雅黑" w:hAnsi="微软雅黑" w:eastAsia="微软雅黑"/>
+          <w:b w:val="0"/>
+          <w:sz w:val="24"/>
+        </w:rPr>
+        <w:t xml:space="preserve">）；逐采样判定另见 </w:t>
       </w:r>
       <w:r>
         <w:rPr>
@@ -2326,6 +2605,61 @@
           <w:sz w:val="24"/>
         </w:rPr>
         <w:t>reports/tke_benchmark.json</w:t>
+      </w:r>
+      <w:r>
+        <w:rPr>
+          <w:rFonts w:ascii="微软雅黑" w:hAnsi="微软雅黑" w:eastAsia="微软雅黑"/>
+          <w:b w:val="0"/>
+          <w:sz w:val="24"/>
+        </w:rPr>
+        <w:t>。</w:t>
+      </w:r>
+    </w:p>
+    <w:p>
+      <w:pPr>
+        <w:pStyle w:val="ListBullet"/>
+      </w:pPr>
+      <w:r>
+        <w:rPr>
+          <w:rFonts w:ascii="微软雅黑" w:hAnsi="微软雅黑" w:eastAsia="微软雅黑"/>
+          <w:b/>
+          <w:sz w:val="24"/>
+        </w:rPr>
+        <w:t>麒麟 VM 全指标实测证据包（2026-09-08）</w:t>
+      </w:r>
+      <w:r>
+        <w:rPr>
+          <w:rFonts w:ascii="微软雅黑" w:hAnsi="微软雅黑" w:eastAsia="微软雅黑"/>
+          <w:b w:val="0"/>
+          <w:sz w:val="24"/>
+        </w:rPr>
+        <w:t xml:space="preserve">：四项赛题指标与麒麟适配在 V11 虚拟机内当日连续采集，34 个原始文件附 SHA256SUMS 完整性清单，索引 </w:t>
+      </w:r>
+      <w:r>
+        <w:rPr>
+          <w:rFonts w:ascii="微软雅黑" w:hAnsi="微软雅黑" w:eastAsia="微软雅黑"/>
+          <w:b w:val="0"/>
+          <w:color w:val="7A3300"/>
+          <w:sz w:val="24"/>
+        </w:rPr>
+        <w:t>competition/09-vm-evidence.md</w:t>
+      </w:r>
+      <w:r>
+        <w:rPr>
+          <w:rFonts w:ascii="微软雅黑" w:hAnsi="微软雅黑" w:eastAsia="微软雅黑"/>
+          <w:b w:val="0"/>
+          <w:sz w:val="24"/>
+        </w:rPr>
+        <w:t xml:space="preserve">，原始数据 </w:t>
+      </w:r>
+      <w:r>
+        <w:rPr>
+          <w:rFonts w:ascii="微软雅黑" w:hAnsi="微软雅黑" w:eastAsia="微软雅黑"/>
+          <w:b w:val="0"/>
+          <w:color w:val="7A3300"/>
+          <w:sz w:val="24"/>
+        </w:rPr>
+        <w:t>reports/kylin-vm-evidence-20260908/</w:t>
       </w:r>
       <w:r>
         <w:rPr>
@@ -2544,6 +2878,23 @@
           <w:b w:val="0"/>
           <w:sz w:val="24"/>
         </w:rPr>
+        <w:t>）。2026-09-08 麒麟 V11 VM 复测：四臂消融 Recall@5 全部 = 1.0，召回能力不依赖任何单一通道、治理开关不影响召回（</w:t>
+      </w:r>
+      <w:r>
+        <w:rPr>
+          <w:rFonts w:ascii="微软雅黑" w:hAnsi="微软雅黑" w:eastAsia="微软雅黑"/>
+          <w:b w:val="0"/>
+          <w:color w:val="7A3300"/>
+          <w:sz w:val="24"/>
+        </w:rPr>
+        <w:t>reports/kylin-vm-evidence-20260908/02-baseline-compare.json</w:t>
+      </w:r>
+      <w:r>
+        <w:rPr>
+          <w:rFonts w:ascii="微软雅黑" w:hAnsi="微软雅黑" w:eastAsia="微软雅黑"/>
+          <w:b w:val="0"/>
+          <w:sz w:val="24"/>
+        </w:rPr>
         <w:t>）。</w:t>
       </w:r>
     </w:p>
@@ -2579,7 +2930,121 @@
           <w:b/>
           <w:sz w:val="28"/>
         </w:rPr>
-        <w:t>3.4 未验证项与优化方向</w:t>
+        <w:t>3.4 未达指标说明与优化方向</w:t>
+      </w:r>
+    </w:p>
+    <w:p>
+      <w:pPr>
+        <w:pStyle w:val="ListBullet"/>
+      </w:pPr>
+      <w:r>
+        <w:rPr>
+          <w:rFonts w:ascii="微软雅黑" w:hAnsi="微软雅黑" w:eastAsia="微软雅黑"/>
+          <w:b/>
+          <w:sz w:val="24"/>
+        </w:rPr>
+        <w:t>偏好提取 VM 当日口径 3/4（MEB-PREF-003 语义通道泄漏）</w:t>
+      </w:r>
+      <w:r>
+        <w:rPr>
+          <w:rFonts w:ascii="微软雅黑" w:hAnsi="微软雅黑" w:eastAsia="微软雅黑"/>
+          <w:b w:val="0"/>
+          <w:sz w:val="24"/>
+        </w:rPr>
+        <w:t>：语义通道将句式相近但主题无关的偏好胶囊带入 top-5（宿主机历史两次运行同错，属确定性行为而非麒麟环境问题；词面通道 4/4 通过）。优化方向：语义候选最低相似度阈值、词面命中加权压制语义-only 候选、偏好类型（preference_type）硬过滤；另 4 例粒度下单例失败即 25 个百分点，用例集粒度需扩容；</w:t>
+      </w:r>
+    </w:p>
+    <w:p>
+      <w:pPr>
+        <w:pStyle w:val="ListBullet"/>
+      </w:pPr>
+      <w:r>
+        <w:rPr>
+          <w:rFonts w:ascii="微软雅黑" w:hAnsi="微软雅黑" w:eastAsia="微软雅黑"/>
+          <w:b/>
+          <w:sz w:val="24"/>
+        </w:rPr>
+        <w:t>EGPM 算法级消融已补测</w:t>
+      </w:r>
+      <w:r>
+        <w:rPr>
+          <w:rFonts w:ascii="微软雅黑" w:hAnsi="微软雅黑" w:eastAsia="微软雅黑"/>
+          <w:b w:val="0"/>
+          <w:sz w:val="24"/>
+        </w:rPr>
+        <w:t>（72 事件 × 6 场景，61.1%，代理检测器口径而非系统指标）：该数据用于论证「朴素累计投票不可靠」，反衬置信度加权 + 确认门设计的必要性（</w:t>
+      </w:r>
+      <w:r>
+        <w:rPr>
+          <w:rFonts w:ascii="微软雅黑" w:hAnsi="微软雅黑" w:eastAsia="微软雅黑"/>
+          <w:b w:val="0"/>
+          <w:color w:val="7A3300"/>
+          <w:sz w:val="24"/>
+        </w:rPr>
+        <w:t>reports/kylin-vm-evidence-20260908/03-egpm-benchmark.json</w:t>
+      </w:r>
+      <w:r>
+        <w:rPr>
+          <w:rFonts w:ascii="微软雅黑" w:hAnsi="微软雅黑" w:eastAsia="微软雅黑"/>
+          <w:b w:val="0"/>
+          <w:sz w:val="24"/>
+        </w:rPr>
+        <w:t>）；Phase-2 结果反馈与真实漂移检测的统一对照基准仍待接入；</w:t>
+      </w:r>
+    </w:p>
+    <w:p>
+      <w:pPr>
+        <w:pStyle w:val="ListBullet"/>
+      </w:pPr>
+      <w:r>
+        <w:rPr>
+          <w:rFonts w:ascii="微软雅黑" w:hAnsi="微软雅黑" w:eastAsia="微软雅黑"/>
+          <w:b/>
+          <w:sz w:val="24"/>
+        </w:rPr>
+        <w:t>检索规模曲线已实测</w:t>
+      </w:r>
+      <w:r>
+        <w:rPr>
+          <w:rFonts w:ascii="微软雅黑" w:hAnsi="微软雅黑" w:eastAsia="微软雅黑"/>
+          <w:b w:val="0"/>
+          <w:sz w:val="24"/>
+        </w:rPr>
+        <w:t>：纯词面通道 50k 条冷态 p95 224.6ms 达标；全栈回退链（语义 brute-force 余弦 + FTS）50k 档 p95 2785ms，万条以上明显退化——语义回退仅作兜底，HNSW（Hierarchical Navigable Small World，分层可导航小世界图索引）为既定优化方向（</w:t>
+      </w:r>
+      <w:r>
+        <w:rPr>
+          <w:rFonts w:ascii="微软雅黑" w:hAnsi="微软雅黑" w:eastAsia="微软雅黑"/>
+          <w:b w:val="0"/>
+          <w:color w:val="7A3300"/>
+          <w:sz w:val="24"/>
+        </w:rPr>
+        <w:t>05-latency-scale.json</w:t>
+      </w:r>
+      <w:r>
+        <w:rPr>
+          <w:rFonts w:ascii="微软雅黑" w:hAnsi="微软雅黑" w:eastAsia="微软雅黑"/>
+          <w:b w:val="0"/>
+          <w:sz w:val="24"/>
+        </w:rPr>
+        <w:t xml:space="preserve"> / </w:t>
+      </w:r>
+      <w:r>
+        <w:rPr>
+          <w:rFonts w:ascii="微软雅黑" w:hAnsi="微软雅黑" w:eastAsia="微软雅黑"/>
+          <w:b w:val="0"/>
+          <w:color w:val="7A3300"/>
+          <w:sz w:val="24"/>
+        </w:rPr>
+        <w:t>05b-latency-scale-fts-only.json</w:t>
+      </w:r>
+      <w:r>
+        <w:rPr>
+          <w:rFonts w:ascii="微软雅黑" w:hAnsi="微软雅黑" w:eastAsia="微软雅黑"/>
+          <w:b w:val="0"/>
+          <w:sz w:val="24"/>
+        </w:rPr>
+        <w:t>）；</w:t>
       </w:r>
     </w:p>
     <w:p>
@@ -2592,33 +3057,7 @@
           <w:b w:val="0"/>
           <w:sz w:val="24"/>
         </w:rPr>
-        <w:t>EGPM Phase-2 结果反馈与真实漂移检测尚未接入统一对照基准，相关消融标记为未验证；</w:t>
-      </w:r>
-    </w:p>
-    <w:p>
-      <w:pPr>
-        <w:pStyle w:val="ListBullet"/>
-      </w:pPr>
-      <w:r>
-        <w:rPr>
-          <w:rFonts w:ascii="微软雅黑" w:hAnsi="微软雅黑" w:eastAsia="微软雅黑"/>
-          <w:b w:val="0"/>
-          <w:sz w:val="24"/>
-        </w:rPr>
-        <w:t>Preference Graph 消融实验未跑（当前由 45 条行为测试锁定），接入统一基准后补充；</w:t>
-      </w:r>
-    </w:p>
-    <w:p>
-      <w:pPr>
-        <w:pStyle w:val="ListBullet"/>
-      </w:pPr>
-      <w:r>
-        <w:rPr>
-          <w:rFonts w:ascii="微软雅黑" w:hAnsi="微软雅黑" w:eastAsia="微软雅黑"/>
-          <w:b w:val="0"/>
-          <w:sz w:val="24"/>
-        </w:rPr>
-        <w:t>50k 条以上规模的检索延迟未测，若面向更大知识库需引入向量索引分区。</w:t>
+        <w:t>Preference Graph 消融实验未跑（当前由 45 条行为测试锁定），接入统一基准后补充。</w:t>
       </w:r>
     </w:p>
     <w:p>
@@ -3073,6 +3512,23 @@
               </w:rPr>
               <w:t>docs/BENCHMARK.md</w:t>
             </w:r>
+            <w:r>
+              <w:rPr>
+                <w:rFonts w:ascii="微软雅黑" w:hAnsi="微软雅黑" w:eastAsia="微软雅黑"/>
+                <w:b w:val="0"/>
+                <w:sz w:val="22"/>
+              </w:rPr>
+              <w:t xml:space="preserve"> + </w:t>
+            </w:r>
+            <w:r>
+              <w:rPr>
+                <w:rFonts w:ascii="微软雅黑" w:hAnsi="微软雅黑" w:eastAsia="微软雅黑"/>
+                <w:b w:val="0"/>
+                <w:color w:val="7A3300"/>
+                <w:sz w:val="22"/>
+              </w:rPr>
+              <w:t>competition/09-vm-evidence.md</w:t>
+            </w:r>
           </w:p>
         </w:tc>
       </w:tr>
@@ -3268,7 +3724,7 @@
                 <w:b w:val="0"/>
                 <w:sz w:val="22"/>
               </w:rPr>
-              <w:t xml:space="preserve">本文 §2.4 + </w:t>
+              <w:t xml:space="preserve">本文 §2.4 + 附录 C + </w:t>
             </w:r>
             <w:r>
               <w:rPr>
@@ -3294,7 +3750,15 @@
                 <w:color w:val="7A3300"/>
                 <w:sz w:val="22"/>
               </w:rPr>
-              <w:t>reports/kylin-native-sdk-evidence/</w:t>
+              <w:t>competition/09-vm-evidence.md</w:t>
+            </w:r>
+            <w:r>
+              <w:rPr>
+                <w:rFonts w:ascii="微软雅黑" w:hAnsi="微软雅黑" w:eastAsia="微软雅黑"/>
+                <w:b w:val="0"/>
+                <w:sz w:val="22"/>
+              </w:rPr>
+              <w:t>（2026-09-08 VM 证据包）</w:t>
             </w:r>
           </w:p>
         </w:tc>
@@ -3588,7 +4052,79 @@
           <w:b w:val="0"/>
           <w:sz w:val="24"/>
         </w:rPr>
-        <w:t>麒麟 V11 虚拟机（x86_64）：原生 SDK 端到端检索 30 次样本 p50 195.320ms / p95 246.473ms（</w:t>
+        <w:t xml:space="preserve">银河麒麟桌面操作系统 V11（Build 20260212，内核 6.6.0-63-generic，Hyper-V 4 vCPU / 7.8 GiB，Python 3.12.3）2026-09-08 当日连续采集，原始数据与复现命令见 </w:t>
+      </w:r>
+      <w:r>
+        <w:rPr>
+          <w:rFonts w:ascii="微软雅黑" w:hAnsi="微软雅黑" w:eastAsia="微软雅黑"/>
+          <w:b w:val="0"/>
+          <w:color w:val="7A3300"/>
+          <w:sz w:val="24"/>
+        </w:rPr>
+        <w:t>competition/09-vm-evidence.md</w:t>
+      </w:r>
+      <w:r>
+        <w:rPr>
+          <w:rFonts w:ascii="微软雅黑" w:hAnsi="微软雅黑" w:eastAsia="微软雅黑"/>
+          <w:b w:val="0"/>
+          <w:sz w:val="24"/>
+        </w:rPr>
+        <w:t xml:space="preserve"> 及 </w:t>
+      </w:r>
+      <w:r>
+        <w:rPr>
+          <w:rFonts w:ascii="微软雅黑" w:hAnsi="微软雅黑" w:eastAsia="微软雅黑"/>
+          <w:b w:val="0"/>
+          <w:color w:val="7A3300"/>
+          <w:sz w:val="24"/>
+        </w:rPr>
+        <w:t>reports/kylin-vm-evidence-20260908/</w:t>
+      </w:r>
+      <w:r>
+        <w:rPr>
+          <w:rFonts w:ascii="微软雅黑" w:hAnsi="微软雅黑" w:eastAsia="微软雅黑"/>
+          <w:b w:val="0"/>
+          <w:sz w:val="24"/>
+        </w:rPr>
+        <w:t>（34 文件 + SHA256SUMS）：</w:t>
+      </w:r>
+    </w:p>
+    <w:p>
+      <w:pPr>
+        <w:pStyle w:val="ListBullet"/>
+      </w:pPr>
+      <w:r>
+        <w:rPr>
+          <w:rFonts w:ascii="微软雅黑" w:hAnsi="微软雅黑" w:eastAsia="微软雅黑"/>
+          <w:b/>
+          <w:sz w:val="24"/>
+        </w:rPr>
+        <w:t>麒麟原生 SDK 端到端检索</w:t>
+      </w:r>
+      <w:r>
+        <w:rPr>
+          <w:rFonts w:ascii="微软雅黑" w:hAnsi="微软雅黑" w:eastAsia="微软雅黑"/>
+          <w:b w:val="0"/>
+          <w:sz w:val="24"/>
+        </w:rPr>
+        <w:t>：常驻 bridge 30 次实测 p50 27.51ms / p95 92.675ms / max 115.393ms（</w:t>
+      </w:r>
+      <w:r>
+        <w:rPr>
+          <w:rFonts w:ascii="微软雅黑" w:hAnsi="微软雅黑" w:eastAsia="微软雅黑"/>
+          <w:b w:val="0"/>
+          <w:color w:val="7A3300"/>
+          <w:sz w:val="24"/>
+        </w:rPr>
+        <w:t>06-kylin-sdk-latency.json</w:t>
+      </w:r>
+      <w:r>
+        <w:rPr>
+          <w:rFonts w:ascii="微软雅黑" w:hAnsi="微软雅黑" w:eastAsia="微软雅黑"/>
+          <w:b w:val="0"/>
+          <w:sz w:val="24"/>
+        </w:rPr>
+        <w:t>）；2026-07 历史 one-shot 冷启动口径为 p50 195.320ms / p95 246.473ms（</w:t>
       </w:r>
       <w:r>
         <w:rPr>
@@ -3605,7 +4141,168 @@
           <w:b w:val="0"/>
           <w:sz w:val="24"/>
         </w:rPr>
-        <w:t>）；常驻桥接优化后 HTTP 全链路 p95 83ms；145 项手机 API 实机验收通过。兼容性验证清单见 Issue #206。</w:t>
+        <w:t>），bridge 化将模型加载移出请求路径；</w:t>
+      </w:r>
+    </w:p>
+    <w:p>
+      <w:pPr>
+        <w:pStyle w:val="ListBullet"/>
+      </w:pPr>
+      <w:r>
+        <w:rPr>
+          <w:rFonts w:ascii="微软雅黑" w:hAnsi="微软雅黑" w:eastAsia="微软雅黑"/>
+          <w:b/>
+          <w:sz w:val="24"/>
+        </w:rPr>
+        <w:t>后端在 V11 原样运行</w:t>
+      </w:r>
+      <w:r>
+        <w:rPr>
+          <w:rFonts w:ascii="微软雅黑" w:hAnsi="微软雅黑" w:eastAsia="微软雅黑"/>
+          <w:b w:val="0"/>
+          <w:sz w:val="24"/>
+        </w:rPr>
+        <w:t xml:space="preserve">：CI 等价配置全量回归 1870 passed / 2 failed / 7 skipped（唯二失败为证据树 tarball 解包缺 </w:t>
+      </w:r>
+      <w:r>
+        <w:rPr>
+          <w:rFonts w:ascii="微软雅黑" w:hAnsi="微软雅黑" w:eastAsia="微软雅黑"/>
+          <w:b w:val="0"/>
+          <w:color w:val="7A3300"/>
+          <w:sz w:val="24"/>
+        </w:rPr>
+        <w:t>.git</w:t>
+      </w:r>
+      <w:r>
+        <w:rPr>
+          <w:rFonts w:ascii="微软雅黑" w:hAnsi="微软雅黑" w:eastAsia="微软雅黑"/>
+          <w:b w:val="0"/>
+          <w:sz w:val="24"/>
+        </w:rPr>
+        <w:t xml:space="preserve"> 的 release-staging 测试，与麒麟无关）；全能力配置 1866 passed / 9 failed，9 例失败逐条归因（7 例为目标机具备而 CI 不具备的 bridge/本地模型能力使测试假设不成立，2 例同 </w:t>
+      </w:r>
+      <w:r>
+        <w:rPr>
+          <w:rFonts w:ascii="微软雅黑" w:hAnsi="微软雅黑" w:eastAsia="微软雅黑"/>
+          <w:b w:val="0"/>
+          <w:color w:val="7A3300"/>
+          <w:sz w:val="24"/>
+        </w:rPr>
+        <w:t>.git</w:t>
+      </w:r>
+      <w:r>
+        <w:rPr>
+          <w:rFonts w:ascii="微软雅黑" w:hAnsi="微软雅黑" w:eastAsia="微软雅黑"/>
+          <w:b w:val="0"/>
+          <w:sz w:val="24"/>
+        </w:rPr>
+        <w:t xml:space="preserve"> 问题），无功能回归；</w:t>
+      </w:r>
+    </w:p>
+    <w:p>
+      <w:pPr>
+        <w:pStyle w:val="ListBullet"/>
+      </w:pPr>
+      <w:r>
+        <w:rPr>
+          <w:rFonts w:ascii="微软雅黑" w:hAnsi="微软雅黑" w:eastAsia="微软雅黑"/>
+          <w:b/>
+          <w:sz w:val="24"/>
+        </w:rPr>
+        <w:t>真实场景全链路</w:t>
+      </w:r>
+      <w:r>
+        <w:rPr>
+          <w:rFonts w:ascii="微软雅黑" w:hAnsi="微软雅黑" w:eastAsia="微软雅黑"/>
+          <w:b w:val="0"/>
+          <w:sz w:val="24"/>
+        </w:rPr>
+        <w:t>：Policy Gate 明文口令拦截 → 可治理知识入库 → 跨会话检索召回（</w:t>
+      </w:r>
+      <w:r>
+        <w:rPr>
+          <w:rFonts w:ascii="微软雅黑" w:hAnsi="微软雅黑" w:eastAsia="微软雅黑"/>
+          <w:b w:val="0"/>
+          <w:color w:val="7A3300"/>
+          <w:sz w:val="24"/>
+        </w:rPr>
+        <w:t>kylin_native</w:t>
+      </w:r>
+      <w:r>
+        <w:rPr>
+          <w:rFonts w:ascii="微软雅黑" w:hAnsi="微软雅黑" w:eastAsia="微软雅黑"/>
+          <w:b w:val="0"/>
+          <w:sz w:val="24"/>
+        </w:rPr>
+        <w:t xml:space="preserve"> 生产路径）→ 自然语言驱动遗忘 → 五处残留取证全零 → 导出含审计编号的 PDF 删除证明证书（</w:t>
+      </w:r>
+      <w:r>
+        <w:rPr>
+          <w:rFonts w:ascii="微软雅黑" w:hAnsi="微软雅黑" w:eastAsia="微软雅黑"/>
+          <w:b w:val="0"/>
+          <w:color w:val="7A3300"/>
+          <w:sz w:val="24"/>
+        </w:rPr>
+        <w:t>09c-*</w:t>
+      </w:r>
+      <w:r>
+        <w:rPr>
+          <w:rFonts w:ascii="微软雅黑" w:hAnsi="微软雅黑" w:eastAsia="微软雅黑"/>
+          <w:b w:val="0"/>
+          <w:sz w:val="24"/>
+        </w:rPr>
+        <w:t>）；</w:t>
+      </w:r>
+    </w:p>
+    <w:p>
+      <w:pPr>
+        <w:pStyle w:val="ListBullet"/>
+      </w:pPr>
+      <w:r>
+        <w:rPr>
+          <w:rFonts w:ascii="微软雅黑" w:hAnsi="微软雅黑" w:eastAsia="微软雅黑"/>
+          <w:b/>
+          <w:sz w:val="24"/>
+        </w:rPr>
+        <w:t>V11 环境行为观测</w:t>
+      </w:r>
+      <w:r>
+        <w:rPr>
+          <w:rFonts w:ascii="微软雅黑" w:hAnsi="微软雅黑" w:eastAsia="微软雅黑"/>
+          <w:b w:val="0"/>
+          <w:sz w:val="24"/>
+        </w:rPr>
+        <w:t xml:space="preserve">：detached（nohup 脱离会话）Python 进程访问回环端口报 </w:t>
+      </w:r>
+      <w:r>
+        <w:rPr>
+          <w:rFonts w:ascii="微软雅黑" w:hAnsi="微软雅黑" w:eastAsia="微软雅黑"/>
+          <w:b w:val="0"/>
+          <w:color w:val="7A3300"/>
+          <w:sz w:val="24"/>
+        </w:rPr>
+        <w:t>EPERM</w:t>
+      </w:r>
+      <w:r>
+        <w:rPr>
+          <w:rFonts w:ascii="微软雅黑" w:hAnsi="微软雅黑" w:eastAsia="微软雅黑"/>
+          <w:b w:val="0"/>
+          <w:sz w:val="24"/>
+        </w:rPr>
+        <w:t>，attached 会话不复现（复现 3 次对照）；部署建议：桌面常驻服务由 systemd user 单元拉起；</w:t>
+      </w:r>
+    </w:p>
+    <w:p>
+      <w:pPr>
+        <w:pStyle w:val="ListBullet"/>
+      </w:pPr>
+      <w:r>
+        <w:rPr>
+          <w:rFonts w:ascii="微软雅黑" w:hAnsi="微软雅黑" w:eastAsia="微软雅黑"/>
+          <w:b w:val="0"/>
+          <w:sz w:val="24"/>
+        </w:rPr>
+        <w:t>145 项手机 API 麒麟实机验收通过（PR #215）；兼容性验证清单见 Issue #206。</w:t>
       </w:r>
     </w:p>
     <w:p>
@@ -3632,7 +4329,7 @@
           <w:b w:val="0"/>
           <w:sz w:val="24"/>
         </w:rPr>
-        <w:t>单节点 alpha 阶段，不宣称生产级高可用；跨部署长期恢复测试、EGPM Phase-2/3 统一对照、Preference Graph 消融未实跑，均已在 §3.4 与 README“诚实边界”中如实标注。</w:t>
+        <w:t>单节点 alpha 阶段，不宣称生产级高可用；偏好提取在 2026-09-08 VM 当日 4 例公开集粒度下为 3/4（75%），已按赛题规则给出明确优化方向，历史 12 例宽口径 91.7% 一并如实列出（§3.1 / §3.4）；跨部署长期恢复测试、EGPM Phase-2/3 统一对照、Preference Graph 消融未实跑，均已在 §3.4 与 README“诚实边界”中如实标注。</w:t>
       </w:r>
     </w:p>
     <w:sectPr>

</xml_diff>